<commit_message>
HPC runbook, authors on the manuscript, and two scheduling fixes
- docs/hpc-runbook.md: goals and priorities after the manuscript
  revision, full-mode sizes (from a dry manifest build), one-time setup,
  W1 interface checks, minimal run, enzyme-density scan, full run in
  priority order, monitoring, result-to-manuscript map, failure playbook
- manuscript: authors Yufeng Zhang and Shi Huang; competing-interests
  wording names S.H.; superscripts rendered in the docx export
- make_manifests: FastANI and skani run only on the simulated T1 set
  (they are the truth anchors on real/scale; 12.5M alignments at 5k
  genomes otherwise)
- config/stage00: minimal mode writes its 10x-smaller genome lists to
  refs/minimal so a later full run does not inherit them (gtdb_lists.py
  refuses to overwrite)
</commit_message>
<xml_diff>
--- a/docs/manuscript.docx
+++ b/docs/manuscript.docx
@@ -13,12 +13,44 @@
     </w:p>
     <w:p>
       <w:r>
-        <w:t xml:space="preserve">Authors: [to be completed] — HuangShiLab, Faculty of Dentistry, The University of Hong Kong, and co-authors.</w:t>
-      </w:r>
-    </w:p>
-    <w:p>
-      <w:r>
-        <w:t xml:space="preserve">Correspondence: Shi Huang (huanglab07@gmail.com)</w:t>
+        <w:t xml:space="preserve">Yufeng Zhang</w:t>
+      </w:r>
+      <w:r>
+        <w:rPr>
+          <w:vertAlign w:val="superscript"/>
+        </w:rPr>
+        <w:t xml:space="preserve">1</w:t>
+      </w:r>
+      <w:r>
+        <w:t xml:space="preserve">, Shi Huang</w:t>
+      </w:r>
+      <w:r>
+        <w:rPr>
+          <w:vertAlign w:val="superscript"/>
+        </w:rPr>
+        <w:t xml:space="preserve">1,*</w:t>
+      </w:r>
+    </w:p>
+    <w:p>
+      <w:r>
+        <w:rPr>
+          <w:vertAlign w:val="superscript"/>
+        </w:rPr>
+        <w:t xml:space="preserve">1</w:t>
+      </w:r>
+      <w:r>
+        <w:t xml:space="preserve"> Faculty of Dentistry, The University of Hong Kong, Hong Kong SAR, China</w:t>
+      </w:r>
+    </w:p>
+    <w:p>
+      <w:r>
+        <w:rPr>
+          <w:vertAlign w:val="superscript"/>
+        </w:rPr>
+        <w:t xml:space="preserve">*</w:t>
+      </w:r>
+      <w:r>
+        <w:t xml:space="preserve"> Correspondence: Shi Huang (huanglab07@gmail.com)</w:t>
       </w:r>
     </w:p>
     <w:p>
@@ -2197,7 +2229,7 @@
         <w:t xml:space="preserve">d=1−C^{1/k}</w:t>
       </w:r>
       <w:r>
-        <w:t xml:space="preserve">  remain unbiased; the Jaccard route of equation (2) does not, because a substitution inside the recognition site deletes the tag from the mutated genome instead of replacing it with a freshly sampled k-mer (§3.7). The tool cluster follows the tasks of §4. MAP2B and its Rust port Fast2bRAD-M profile metagenomes from tags, deciding presence on species-specific tag subsets with a breadth-times-depth score (the G-score) and a learned false-positive filter [117,118,120]; Syn2bANI estimates ANI between genomes from tag anchors — because tags occupy fixed positions, matches chain without a seeding step, and aligned fraction and structural-variant calls come out of the same pass [119]; Strain2bScan and sk2bGrow carry the same tag sets to strain-level and growth-dynamics estimands [122,123]. In this review the motif predicate enters the benchmark twice: as a tool-free mechanism row (in-silico tags scored with containment and Bray–Curtis estimators, so that the sampling rule is measured apart from any tool) and as the tool rows. We state the competing interest here as well as in §9: several authors develop these tools, and the benchmark design was fixed before any tag-based result existed.</w:t>
+        <w:t xml:space="preserve">  remain unbiased; the Jaccard route of equation (2) does not, because a substitution inside the recognition site deletes the tag from the mutated genome instead of replacing it with a freshly sampled k-mer (§3.7). The tool cluster follows the tasks of §4. MAP2B and its Rust port Fast2bRAD-M profile metagenomes from tags, deciding presence on species-specific tag subsets with a breadth-times-depth score (the G-score) and a learned false-positive filter [117,118,120]; Syn2bANI estimates ANI between genomes from tag anchors — because tags occupy fixed positions, matches chain without a seeding step, and aligned fraction and structural-variant calls come out of the same pass [119]; Strain2bScan and sk2bGrow carry the same tag sets to strain-level and growth-dynamics estimands [122,123]. In this review the motif predicate enters the benchmark twice: as a tool-free mechanism row (in-silico tags scored with containment and Bray–Curtis estimators, so that the sampling rule is measured apart from any tool) and as the tool rows. We state the competing interest here as well as in §9: one of the authors develops these tools, and the benchmark design was fixed before any tag-based result existed.</w:t>
       </w:r>
     </w:p>
     <w:p>
@@ -9585,7 +9617,7 @@
     </w:p>
     <w:p>
       <w:r>
-        <w:t xml:space="preserve">Three limitations bound the conclusions. First, the scope is nucleotide k-mer sketches; protein-level sketching enters only as an open question (§8, Q7), because the alphabet change alters k-mer space size, mutation dynamics, and every family-specific estimator assumption at once. Second, the benchmark results are pending: §5 is a protocol with placeholders, and the empirical claims it is designed to settle will land when the compute runs complete; until then the eligibility matrix rests on theory and on the tools' own validations. Third, the motif-defined family is developed by several of the authors. We have addressed this by fixing the benchmark design before any tag-based result existed, by scoring the mechanism apart from the tools, by reporting no-estimate rates and the Jaccard-route bias rather than only the favourable containment route, and by stating the interest below; readers should nonetheless weigh the family's rows with that in mind.</w:t>
+        <w:t xml:space="preserve">Three limitations bound the conclusions. First, the scope is nucleotide k-mer sketches; protein-level sketching enters only as an open question (§8, Q7), because the alphabet change alters k-mer space size, mutation dynamics, and every family-specific estimator assumption at once. Second, the benchmark results are pending: §5 is a protocol with placeholders, and the empirical claims it is designed to settle will land when the compute runs complete; until then the eligibility matrix rests on theory and on the tools' own validations. Third, the motif-defined family is developed by one of the authors. We have addressed this by fixing the benchmark design before any tag-based result existed, by scoring the mechanism apart from the tools, by reporting no-estimate rates and the Jaccard-route bias rather than only the favourable containment route, and by stating the interest below; readers should nonetheless weigh the family's rows with that in mind.</w:t>
       </w:r>
     </w:p>
     <w:p>
@@ -9599,7 +9631,7 @@
     </w:p>
     <w:p>
       <w:r>
-        <w:t xml:space="preserve">[Authors] develop 2bRAD-M, Fast2bRAD-M, Syn2bANI, Strain2bScan and sk2bGrow. The benchmark protocol (§5) and its implementation [126] were committed before any result for these tools existed, and the design and the results will be released together with their version history. The other tools benchmarked are not developed by the authors.</w:t>
+        <w:t xml:space="preserve">S.H. is a co-developer of 2bRAD-M and leads the development of Fast2bRAD-M, Syn2bANI, Strain2bScan and sk2bGrow. The benchmark protocol (§5) and its implementation [126] were committed before any result for these tools existed, and the design and the results will be released together with their version history. The other tools benchmarked are not developed by the authors.</w:t>
       </w:r>
     </w:p>
     <w:p>

</xml_diff>